<commit_message>
Update OJS journal path routing and add seamless /drj/ to /main/ redirect shim
</commit_message>
<xml_diff>
--- a/Davao_Research_Journal_Project_Proposal_3_Modules.docx
+++ b/Davao_Research_Journal_Project_Proposal_3_Modules.docx
@@ -1094,7 +1094,31 @@
           <w:color w:val="0F172A"/>
           <w:sz w:val="19"/>
         </w:rPr>
-        <w:t>https://davaoresearchjournal.ph/index.php/drj/submission/wizard</w:t>
+        <w:t>https://davaoresearchjournal.ph/index.php/main/submission/wizard</w:t>
+      </w:r>
+      <w:r>
+        <w:rPr>
+          <w:rFonts w:ascii="Calibri" w:hAnsi="Calibri"/>
+          <w:color w:val="1E293B"/>
+          <w:sz w:val="20"/>
+        </w:rPr>
+        <w:t xml:space="preserve"> (or </w:t>
+      </w:r>
+      <w:r>
+        <w:rPr>
+          <w:rFonts w:ascii="Consolas" w:hAnsi="Consolas"/>
+          <w:color w:val="0F172A"/>
+          <w:sz w:val="19"/>
+        </w:rPr>
+        <w:t>/drj/submission/wizard</w:t>
+      </w:r>
+      <w:r>
+        <w:rPr>
+          <w:rFonts w:ascii="Calibri" w:hAnsi="Calibri"/>
+          <w:color w:val="1E293B"/>
+          <w:sz w:val="20"/>
+        </w:rPr>
+        <w:t>)</w:t>
       </w:r>
     </w:p>
     <w:p>
@@ -1282,7 +1306,31 @@
           <w:color w:val="0F172A"/>
           <w:sz w:val="19"/>
         </w:rPr>
-        <w:t>https://davaoresearchjournal.ph/index.php/drj/workflow/index</w:t>
+        <w:t>https://davaoresearchjournal.ph/index.php/main/workflow/index</w:t>
+      </w:r>
+      <w:r>
+        <w:rPr>
+          <w:rFonts w:ascii="Calibri" w:hAnsi="Calibri"/>
+          <w:color w:val="1E293B"/>
+          <w:sz w:val="20"/>
+        </w:rPr>
+        <w:t xml:space="preserve"> (or </w:t>
+      </w:r>
+      <w:r>
+        <w:rPr>
+          <w:rFonts w:ascii="Consolas" w:hAnsi="Consolas"/>
+          <w:color w:val="0F172A"/>
+          <w:sz w:val="19"/>
+        </w:rPr>
+        <w:t>/drj/workflow/index</w:t>
+      </w:r>
+      <w:r>
+        <w:rPr>
+          <w:rFonts w:ascii="Calibri" w:hAnsi="Calibri"/>
+          <w:color w:val="1E293B"/>
+          <w:sz w:val="20"/>
+        </w:rPr>
+        <w:t>)</w:t>
       </w:r>
     </w:p>
     <w:p>

</xml_diff>